<commit_message>
Vergleichstest ausgeführte Makros in Word, PDF und Markdown (#218)
Der Paritäts-Space bekommt die Seite „Makros“ mit include und excerpt-include
einer Seite aus einem anderen Space und children mit der Kindseite „Juliett“.
Die eingesetzten Sätze stehen nur in der Leseansicht. Der neue Prüfpunkt
„makros“ verlangt sie in jedem Core-Export und keine OMITTED_CONTENT-Meldung
der Konvertierung. Ergebnis: gleich in Word, PDF und Markdown.

EAC-Referenzen neu erzeugt (Commit unverändert). PARITY.md: Zeile Makros
in Exporten gleich, Prüfpunkt ergänzt.

Closes #218. Teil von #193.

Co-Authored-By: Claude Opus 5.5 (1M context) <noreply@anthropic.com>
Claude-Session: https://claude.ai/code/session_013LrETLtQtKh1cCXYGLeVRY
</commit_message>
<xml_diff>
--- a/parity-tests/src/test/resources/eac/parity.docx
+++ b/parity-tests/src/test/resources/eac/parity.docx
@@ -562,6 +562,70 @@
           <w:i w:val="on"/>
         </w:rPr>
         <w:t>[Abbildung nicht verfügbar]</w:t>
+      </w:r>
+    </w:p>
+    <w:p>
+      <w:pPr>
+        <w:pStyle w:val="Heading3"/>
+      </w:pPr>
+      <w:r>
+        <w:t>Makros</w:t>
+      </w:r>
+    </w:p>
+    <w:p>
+      <w:pPr>
+        <w:pStyle w:val="Heading4"/>
+      </w:pPr>
+      <w:r>
+        <w:t>Makros</w:t>
+      </w:r>
+    </w:p>
+    <w:p>
+      <w:r>
+        <w:t>Satz Golf vor den Makros.</w:t>
+      </w:r>
+    </w:p>
+    <w:p>
+      <w:r>
+        <w:t>Satz Hotel aus dem Baustein.</w:t>
+      </w:r>
+    </w:p>
+    <w:p>
+      <w:r>
+        <w:t>Satz India aus dem Auszug.</w:t>
+      </w:r>
+    </w:p>
+    <w:p>
+      <w:pPr>
+        <w:numPr>
+          <w:ilvl w:val="0"/>
+          <w:numId w:val="1"/>
+        </w:numPr>
+        <w:spacing w:after="40"/>
+      </w:pPr>
+      <w:r>
+        <w:t>Juliett</w:t>
+      </w:r>
+    </w:p>
+    <w:p>
+      <w:pPr>
+        <w:pStyle w:val="Heading4"/>
+      </w:pPr>
+      <w:r>
+        <w:t>Juliett</w:t>
+      </w:r>
+    </w:p>
+    <w:p>
+      <w:pPr>
+        <w:pStyle w:val="Heading5"/>
+      </w:pPr>
+      <w:r>
+        <w:t>Juliett</w:t>
+      </w:r>
+    </w:p>
+    <w:p>
+      <w:r>
+        <w:t>Satz Juliett.</w:t>
       </w:r>
     </w:p>
   </w:body>

</xml_diff>

<commit_message>
parity-tests: Paritäts-Space aus ParityConfluence (#345), EAC-Referenzen neu
Co-Authored-By: Claude Opus 5.5 (1M context) <noreply@anthropic.com>
Claude-Session: https://claude.ai/code/session_013LrETLtQtKh1cCXYGLeVRY
</commit_message>
<xml_diff>
--- a/parity-tests/src/test/resources/eac/parity.docx
+++ b/parity-tests/src/test/resources/eac/parity.docx
@@ -626,6 +626,69 @@
     <w:p>
       <w:r>
         <w:t>Satz Juliett.</w:t>
+      </w:r>
+    </w:p>
+    <w:p>
+      <w:pPr>
+        <w:pStyle w:val="Heading3"/>
+      </w:pPr>
+      <w:r>
+        <w:t>Anhänge</w:t>
+      </w:r>
+    </w:p>
+    <w:p>
+      <w:pPr>
+        <w:pStyle w:val="Heading4"/>
+      </w:pPr>
+      <w:r>
+        <w:t>Anhänge</w:t>
+      </w:r>
+    </w:p>
+    <w:p>
+      <w:r>
+        <w:t>Satz Kilo zu den Anhängen.</w:t>
+      </w:r>
+    </w:p>
+    <w:p>
+      <w:r>
+        <w:t>Satz Lima mit Symbol im Text. Satz Mike nach dem Symbol.</w:t>
+      </w:r>
+    </w:p>
+    <w:p>
+      <w:r>
+        <w:rPr>
+          <w:i w:val="on"/>
+        </w:rPr>
+        <w:t>[Abbildung nicht verfügbar: symbol.svg]</w:t>
+      </w:r>
+    </w:p>
+    <w:p>
+      <w:r>
+        <w:t>PAR-7 - Getting issue details...</w:t>
+      </w:r>
+    </w:p>
+    <w:p>
+      <w:pPr>
+        <w:numPr>
+          <w:ilvl w:val="0"/>
+          <w:numId w:val="1"/>
+        </w:numPr>
+        <w:spacing w:after="40"/>
+      </w:pPr>
+      <w:r>
+        <w:t>handbuch.pdf</w:t>
+      </w:r>
+    </w:p>
+    <w:p>
+      <w:pPr>
+        <w:numPr>
+          <w:ilvl w:val="0"/>
+          <w:numId w:val="1"/>
+        </w:numPr>
+        <w:spacing w:after="40"/>
+      </w:pPr>
+      <w:r>
+        <w:t>vorlage.docx</w:t>
       </w:r>
     </w:p>
   </w:body>

</xml_diff>

<commit_message>
parity-tests: EAC-Referenzen für ParityConfluence nach #345 neu
Co-Authored-By: Claude Opus 5.5 (1M context) <noreply@anthropic.com>
Claude-Session: https://claude.ai/code/session_013LrETLtQtKh1cCXYGLeVRY
</commit_message>
<xml_diff>
--- a/parity-tests/src/test/resources/eac/parity.docx
+++ b/parity-tests/src/test/resources/eac/parity.docx
@@ -565,6 +565,54 @@
       </w:r>
     </w:p>
     <w:p>
+      <w:r>
+        <w:drawing>
+          <wp:inline distT="0" distR="0" distB="0" distL="0">
+            <wp:extent cx="9525" cy="9525"/>
+            <wp:docPr id="2" name="Drawing 2" descr="abbildung-3.png"/>
+            <a:graphic xmlns:a="http://schemas.openxmlformats.org/drawingml/2006/main">
+              <a:graphicData uri="http://schemas.openxmlformats.org/drawingml/2006/picture">
+                <pic:pic xmlns:pic="http://schemas.openxmlformats.org/drawingml/2006/picture">
+                  <pic:nvPicPr>
+                    <pic:cNvPr id="0" name="Picture 2" descr="abbildung-3.png"/>
+                    <pic:cNvPicPr>
+                      <a:picLocks noChangeAspect="true"/>
+                    </pic:cNvPicPr>
+                  </pic:nvPicPr>
+                  <pic:blipFill>
+                    <a:blip r:embed="rId6"/>
+                    <a:stretch>
+                      <a:fillRect/>
+                    </a:stretch>
+                  </pic:blipFill>
+                  <pic:spPr>
+                    <a:xfrm>
+                      <a:off x="0" y="0"/>
+                      <a:ext cx="9525" cy="9525"/>
+                    </a:xfrm>
+                    <a:prstGeom prst="rect">
+                      <a:avLst/>
+                    </a:prstGeom>
+                  </pic:spPr>
+                </pic:pic>
+              </a:graphicData>
+            </a:graphic>
+          </wp:inline>
+        </w:drawing>
+      </w:r>
+      <w:r>
+        <w:br/>
+      </w:r>
+      <w:r>
+        <w:rPr>
+          <w:sz w:val="18"/>
+          <w:i w:val="on"/>
+          <w:color w:val="6B6B6B"/>
+        </w:rPr>
+        <w:t>ablauf</w:t>
+      </w:r>
+    </w:p>
+    <w:p>
       <w:pPr>
         <w:pStyle w:val="Heading3"/>
       </w:pPr>
@@ -656,10 +704,50 @@
     </w:p>
     <w:p>
       <w:r>
+        <w:drawing>
+          <wp:inline distT="0" distR="0" distB="0" distL="0">
+            <wp:extent cx="5715000" cy="5715000"/>
+            <wp:docPr id="3" name="Drawing 3" descr="abbildung-4.png"/>
+            <a:graphic xmlns:a="http://schemas.openxmlformats.org/drawingml/2006/main">
+              <a:graphicData uri="http://schemas.openxmlformats.org/drawingml/2006/picture">
+                <pic:pic xmlns:pic="http://schemas.openxmlformats.org/drawingml/2006/picture">
+                  <pic:nvPicPr>
+                    <pic:cNvPr id="0" name="Picture 3" descr="abbildung-4.png"/>
+                    <pic:cNvPicPr>
+                      <a:picLocks noChangeAspect="true"/>
+                    </pic:cNvPicPr>
+                  </pic:nvPicPr>
+                  <pic:blipFill>
+                    <a:blip r:embed="rId7"/>
+                    <a:stretch>
+                      <a:fillRect/>
+                    </a:stretch>
+                  </pic:blipFill>
+                  <pic:spPr>
+                    <a:xfrm>
+                      <a:off x="0" y="0"/>
+                      <a:ext cx="5715000" cy="5715000"/>
+                    </a:xfrm>
+                    <a:prstGeom prst="rect">
+                      <a:avLst/>
+                    </a:prstGeom>
+                  </pic:spPr>
+                </pic:pic>
+              </a:graphicData>
+            </a:graphic>
+          </wp:inline>
+        </w:drawing>
+      </w:r>
+      <w:r>
+        <w:br/>
+      </w:r>
+      <w:r>
         <w:rPr>
+          <w:sz w:val="18"/>
           <w:i w:val="on"/>
+          <w:color w:val="6B6B6B"/>
         </w:rPr>
-        <w:t>[Abbildung nicht verfügbar: symbol.svg]</w:t>
+        <w:t>symbol.svg</w:t>
       </w:r>
     </w:p>
     <w:p>
@@ -689,6 +777,54 @@
       </w:pPr>
       <w:r>
         <w:t>vorlage.docx</w:t>
+      </w:r>
+    </w:p>
+    <w:p>
+      <w:r>
+        <w:drawing>
+          <wp:inline distT="0" distR="0" distB="0" distL="0">
+            <wp:extent cx="9525" cy="9525"/>
+            <wp:docPr id="4" name="Drawing 4" descr="abbildung-5.png"/>
+            <a:graphic xmlns:a="http://schemas.openxmlformats.org/drawingml/2006/main">
+              <a:graphicData uri="http://schemas.openxmlformats.org/drawingml/2006/picture">
+                <pic:pic xmlns:pic="http://schemas.openxmlformats.org/drawingml/2006/picture">
+                  <pic:nvPicPr>
+                    <pic:cNvPr id="0" name="Picture 4" descr="abbildung-5.png"/>
+                    <pic:cNvPicPr>
+                      <a:picLocks noChangeAspect="true"/>
+                    </pic:cNvPicPr>
+                  </pic:nvPicPr>
+                  <pic:blipFill>
+                    <a:blip r:embed="rId6"/>
+                    <a:stretch>
+                      <a:fillRect/>
+                    </a:stretch>
+                  </pic:blipFill>
+                  <pic:spPr>
+                    <a:xfrm>
+                      <a:off x="0" y="0"/>
+                      <a:ext cx="9525" cy="9525"/>
+                    </a:xfrm>
+                    <a:prstGeom prst="rect">
+                      <a:avLst/>
+                    </a:prstGeom>
+                  </pic:spPr>
+                </pic:pic>
+              </a:graphicData>
+            </a:graphic>
+          </wp:inline>
+        </w:drawing>
+      </w:r>
+      <w:r>
+        <w:br/>
+      </w:r>
+      <w:r>
+        <w:rPr>
+          <w:sz w:val="18"/>
+          <w:i w:val="on"/>
+          <w:color w:val="6B6B6B"/>
+        </w:rPr>
+        <w:t>ablauf</w:t>
       </w:r>
     </w:p>
   </w:body>

</xml_diff>

<commit_message>
Parity space: mentions with hidden and included duplicates
Page 1002 mentions a user by key with a hidden mention beside it in the
view; page 1009 mentions one after an included page that brings its own
mention. With stored views the core export shows the view's names and
neither duplicate shifts the mapping. EAC references regenerated with
the unchanged parity-tests/eac/generate.sh against bdaf512e.

Co-Authored-By: Claude Opus 5.5 (1M context) <noreply@anthropic.com>
Claude-Session: https://claude.ai/code/session_01NWXgKaH67Z8Ee3ptYGuTry
</commit_message>
<xml_diff>
--- a/parity-tests/src/test/resources/eac/parity.docx
+++ b/parity-tests/src/test/resources/eac/parity.docx
@@ -386,6 +386,11 @@
       </w:r>
     </w:p>
     <w:p>
+      <w:r>
+        <w:t>Ansprechpartnerin ist Anna Schmidt.</w:t>
+      </w:r>
+    </w:p>
+    <w:p>
       <w:pPr>
         <w:pStyle w:val="Heading4"/>
       </w:pPr>
@@ -635,7 +640,7 @@
     </w:p>
     <w:p>
       <w:r>
-        <w:t>Satz Hotel aus dem Baustein.</w:t>
+        <w:t>Satz Hotel aus dem Baustein. Von Bernd Wagner.</w:t>
       </w:r>
     </w:p>
     <w:p>
@@ -653,6 +658,11 @@
       </w:pPr>
       <w:r>
         <w:t>Juliett</w:t>
+      </w:r>
+    </w:p>
+    <w:p>
+      <w:r>
+        <w:t>Fragen an Carla Conrad.</w:t>
       </w:r>
     </w:p>
     <w:p>

</xml_diff>

<commit_message>
Parity space: a page whose view renders only one of two macros
Page 1012 "Zählung" has two contentbylabel macros in storage while the
view rendered one; the core reports view-count-mismatch instead of
guessing, which the parity report lists as intended since #441. EAC
references regenerated with the unchanged generate.sh against bdaf512e.

Co-Authored-By: Claude Opus 5.5 (1M context) <noreply@anthropic.com>
Claude-Session: https://claude.ai/code/session_01NWXgKaH67Z8Ee3ptYGuTry
</commit_message>
<xml_diff>
--- a/parity-tests/src/test/resources/eac/parity.docx
+++ b/parity-tests/src/test/resources/eac/parity.docx
@@ -835,6 +835,39 @@
           <w:color w:val="6B6B6B"/>
         </w:rPr>
         <w:t>ablauf</w:t>
+      </w:r>
+    </w:p>
+    <w:p>
+      <w:pPr>
+        <w:pStyle w:val="Heading3"/>
+      </w:pPr>
+      <w:r>
+        <w:t>Zählung</w:t>
+      </w:r>
+    </w:p>
+    <w:p>
+      <w:pPr>
+        <w:pStyle w:val="Heading4"/>
+      </w:pPr>
+      <w:r>
+        <w:t>Zählung</w:t>
+      </w:r>
+    </w:p>
+    <w:p>
+      <w:r>
+        <w:t>Satz Quebec zur Zählung.</w:t>
+      </w:r>
+    </w:p>
+    <w:p>
+      <w:pPr>
+        <w:numPr>
+          <w:ilvl w:val="0"/>
+          <w:numId w:val="1"/>
+        </w:numPr>
+        <w:spacing w:after="40"/>
+      </w:pPr>
+      <w:r>
+        <w:t>Architektur</w:t>
       </w:r>
     </w:p>
   </w:body>

</xml_diff>

<commit_message>
Parity space: a page whose view renders only one of two macros (#443)
Page 1012 "Zählung" has two contentbylabel macros in storage while the
view rendered one; the core reports view-count-mismatch instead of
guessing, which the parity report lists as intended since #441. EAC
references regenerated with the unchanged generate.sh against bdaf512e.


Claude-Session: https://claude.ai/code/session_01NWXgKaH67Z8Ee3ptYGuTry

Co-authored-by: Claude <noreply@anthropic.com>
</commit_message>
<xml_diff>
--- a/parity-tests/src/test/resources/eac/parity.docx
+++ b/parity-tests/src/test/resources/eac/parity.docx
@@ -835,6 +835,39 @@
           <w:color w:val="6B6B6B"/>
         </w:rPr>
         <w:t>ablauf</w:t>
+      </w:r>
+    </w:p>
+    <w:p>
+      <w:pPr>
+        <w:pStyle w:val="Heading3"/>
+      </w:pPr>
+      <w:r>
+        <w:t>Zählung</w:t>
+      </w:r>
+    </w:p>
+    <w:p>
+      <w:pPr>
+        <w:pStyle w:val="Heading4"/>
+      </w:pPr>
+      <w:r>
+        <w:t>Zählung</w:t>
+      </w:r>
+    </w:p>
+    <w:p>
+      <w:r>
+        <w:t>Satz Quebec zur Zählung.</w:t>
+      </w:r>
+    </w:p>
+    <w:p>
+      <w:pPr>
+        <w:numPr>
+          <w:ilvl w:val="0"/>
+          <w:numId w:val="1"/>
+        </w:numPr>
+        <w:spacing w:after="40"/>
+      </w:pPr>
+      <w:r>
+        <w:t>Architektur</w:t>
       </w:r>
     </w:p>
   </w:body>

</xml_diff>